<commit_message>
fix: correct SHAP 6a features, R10 ablation prose, add Q7 traceability table
- SHAP Table 6a: ranks 1-2 now show K_agg/A_agg (was B20_1/B18_3)
- R10 prose: ablation value corrected to -0.0055 at depth 5, p=0.1652
- Q7: add 28-row claims-to-evidence traceability table mapping every
  quantitative claim to its source in manuscript_tables.txt

Co-Authored-By: Claude Sonnet 4.6 <noreply@anthropic.com>
Claude-Session: https://claude.ai/code/session_01VADmG4erFwh9AZJJyJ5yqP
</commit_message>
<xml_diff>
--- a/docs/Ofori_Prince_Phase1_Results_R11.docx
+++ b/docs/Ofori_Prince_Phase1_Results_R11.docx
@@ -2359,7 +2359,7 @@
                 <w:color w:val="000000"/>
                 <w:sz w:val="18"/>
               </w:rPr>
-              <w:t>B20_1</w:t>
+              <w:t>K_agg</w:t>
             </w:r>
           </w:p>
         </w:tc>
@@ -2409,7 +2409,7 @@
                 <w:color w:val="000000"/>
                 <w:sz w:val="18"/>
               </w:rPr>
-              <w:t>B18_3</w:t>
+              <w:t>A_agg</w:t>
             </w:r>
           </w:p>
         </w:tc>
@@ -3817,7 +3817,7 @@
           <w:color w:val="000000"/>
           <w:sz w:val="24"/>
         </w:rPr>
-        <w:t>The study reports a null primary result across both datasets and both statistical tests. KAB-XGBoost-WCE does not beat Baseline XGBoost on KNUST (p = 0.5407) or Alzubaidi (p = 0.1703). The weighting's isolated ablation contribution is +0.0026 (not significant). The honest conclusion is that the KAB asymmetry weighting adds no measurable value on either dataset in R11.</w:t>
+        <w:t>The study reports a null primary result across both datasets and both statistical tests. KAB-XGBoost-WCE does not beat Baseline XGBoost on KNUST (p = 0.5407) or Alzubaidi (p = 0.1703). The weighting's isolated ablation contribution at depth 5 is -0.0055 (p = 0.1652, not significant). The honest conclusion is that the KAB asymmetry weighting adds no measurable value on either dataset in R11.</w:t>
       </w:r>
     </w:p>
     <w:p>
@@ -4777,6 +4777,1736 @@
       <w:cols w:space="720"/>
       <w:docGrid w:linePitch="360"/>
     </w:sectPr>
+    <w:p>
+      <w:pPr>
+        <w:pStyle w:val="Heading2"/>
+      </w:pPr>
+      <w:r>
+        <w:rPr>
+          <w:rFonts w:ascii="Times New Roman" w:hAnsi="Times New Roman"/>
+          <w:sz w:val="24"/>
+          <w:b/>
+        </w:rPr>
+        <w:t>Q7. Claims-to-Evidence Traceability Table</w:t>
+      </w:r>
+    </w:p>
+    <w:p>
+      <w:r>
+        <w:rPr>
+          <w:rFonts w:ascii="Times New Roman" w:hAnsi="Times New Roman"/>
+          <w:sz w:val="18"/>
+        </w:rPr>
+        <w:t xml:space="preserve">Every quantitative claim in this document maps to a row below. The source column names the file or section of manuscript_tables.txt that holds the raw number. All numbers come from a single R11 pipeline run.</w:t>
+      </w:r>
+    </w:p>
+    <w:tbl>
+      <w:tblPr>
+        <w:tblW w:type="dxa" w:w="9000"/>
+        <w:tblBorders>
+          <w:top w:val="single" w:sz="4" w:space="0" w:color="000000"/>
+          <w:left w:val="single" w:sz="4" w:space="0" w:color="000000"/>
+          <w:bottom w:val="single" w:sz="4" w:space="0" w:color="000000"/>
+          <w:right w:val="single" w:sz="4" w:space="0" w:color="000000"/>
+          <w:insideH w:val="single" w:sz="4" w:space="0" w:color="000000"/>
+          <w:insideV w:val="single" w:sz="4" w:space="0" w:color="000000"/>
+        </w:tblBorders>
+      </w:tblPr>
+      <w:tr>
+        <w:tc>
+          <w:tcPr>
+            <w:tcW w:type="dxa" w:w="3800"/>
+          </w:tcPr>
+          <w:p>
+            <w:r>
+              <w:rPr>
+                <w:rFonts w:ascii="Times New Roman" w:hAnsi="Times New Roman"/>
+                <w:sz w:val="18"/>
+                <w:b/>
+              </w:rPr>
+              <w:t xml:space="preserve">Claim</w:t>
+            </w:r>
+          </w:p>
+        </w:tc>
+        <w:tc>
+          <w:tcPr>
+            <w:tcW w:type="dxa" w:w="800"/>
+          </w:tcPr>
+          <w:p>
+            <w:r>
+              <w:rPr>
+                <w:rFonts w:ascii="Times New Roman" w:hAnsi="Times New Roman"/>
+                <w:sz w:val="18"/>
+                <w:b/>
+              </w:rPr>
+              <w:t xml:space="preserve">Section</w:t>
+            </w:r>
+          </w:p>
+        </w:tc>
+        <w:tc>
+          <w:tcPr>
+            <w:tcW w:type="dxa" w:w="2400"/>
+          </w:tcPr>
+          <w:p>
+            <w:r>
+              <w:rPr>
+                <w:rFonts w:ascii="Times New Roman" w:hAnsi="Times New Roman"/>
+                <w:sz w:val="18"/>
+                <w:b/>
+              </w:rPr>
+              <w:t xml:space="preserve">Source</w:t>
+            </w:r>
+          </w:p>
+        </w:tc>
+        <w:tc>
+          <w:tcPr>
+            <w:tcW w:type="dxa" w:w="2000"/>
+          </w:tcPr>
+          <w:p>
+            <w:r>
+              <w:rPr>
+                <w:rFonts w:ascii="Times New Roman" w:hAnsi="Times New Roman"/>
+                <w:sz w:val="18"/>
+                <w:b/>
+              </w:rPr>
+              <w:t xml:space="preserve">Verified value</w:t>
+            </w:r>
+          </w:p>
+        </w:tc>
+      </w:tr>
+      <w:tr>
+        <w:tc>
+          <w:tcPr>
+            <w:tcW w:type="dxa" w:w="3800"/>
+          </w:tcPr>
+          <w:p>
+            <w:r>
+              <w:rPr>
+                <w:rFonts w:ascii="Times New Roman" w:hAnsi="Times New Roman"/>
+                <w:sz w:val="18"/>
+              </w:rPr>
+              <w:t xml:space="preserve">KNUST: 4,121 raw responses, 2,033 duplicates removed, 2,088 unique retained</w:t>
+            </w:r>
+          </w:p>
+        </w:tc>
+        <w:tc>
+          <w:tcPr>
+            <w:tcW w:type="dxa" w:w="800"/>
+          </w:tcPr>
+          <w:p>
+            <w:r>
+              <w:rPr>
+                <w:rFonts w:ascii="Times New Roman" w:hAnsi="Times New Roman"/>
+                <w:sz w:val="18"/>
+              </w:rPr>
+              <w:t xml:space="preserve">R1</w:t>
+            </w:r>
+          </w:p>
+        </w:tc>
+        <w:tc>
+          <w:tcPr>
+            <w:tcW w:type="dxa" w:w="2400"/>
+          </w:tcPr>
+          <w:p>
+            <w:r>
+              <w:rPr>
+                <w:rFonts w:ascii="Times New Roman" w:hAnsi="Times New Roman"/>
+                <w:sz w:val="18"/>
+              </w:rPr>
+              <w:t xml:space="preserve">manuscript_tables.txt KEY NUMBERS</w:t>
+            </w:r>
+          </w:p>
+        </w:tc>
+        <w:tc>
+          <w:tcPr>
+            <w:tcW w:type="dxa" w:w="2000"/>
+          </w:tcPr>
+          <w:p>
+            <w:r>
+              <w:rPr>
+                <w:rFonts w:ascii="Times New Roman" w:hAnsi="Times New Roman"/>
+                <w:sz w:val="18"/>
+              </w:rPr>
+              <w:t xml:space="preserve">raw=4121, removed=2033, unique=2088</w:t>
+            </w:r>
+          </w:p>
+        </w:tc>
+      </w:tr>
+      <w:tr>
+        <w:tc>
+          <w:tcPr>
+            <w:tcW w:type="dxa" w:w="3800"/>
+          </w:tcPr>
+          <w:p>
+            <w:r>
+              <w:rPr>
+                <w:rFonts w:ascii="Times New Roman" w:hAnsi="Times New Roman"/>
+                <w:sz w:val="18"/>
+              </w:rPr>
+              <w:t xml:space="preserve">KNUST class balance: Low 1,167 (55.9%), High 921 (44.1%)</w:t>
+            </w:r>
+          </w:p>
+        </w:tc>
+        <w:tc>
+          <w:tcPr>
+            <w:tcW w:type="dxa" w:w="800"/>
+          </w:tcPr>
+          <w:p>
+            <w:r>
+              <w:rPr>
+                <w:rFonts w:ascii="Times New Roman" w:hAnsi="Times New Roman"/>
+                <w:sz w:val="18"/>
+              </w:rPr>
+              <w:t xml:space="preserve">R1</w:t>
+            </w:r>
+          </w:p>
+        </w:tc>
+        <w:tc>
+          <w:tcPr>
+            <w:tcW w:type="dxa" w:w="2400"/>
+          </w:tcPr>
+          <w:p>
+            <w:r>
+              <w:rPr>
+                <w:rFonts w:ascii="Times New Roman" w:hAnsi="Times New Roman"/>
+                <w:sz w:val="18"/>
+              </w:rPr>
+              <w:t xml:space="preserve">manuscript_tables.txt KEY NUMBERS</w:t>
+            </w:r>
+          </w:p>
+        </w:tc>
+        <w:tc>
+          <w:tcPr>
+            <w:tcW w:type="dxa" w:w="2000"/>
+          </w:tcPr>
+          <w:p>
+            <w:r>
+              <w:rPr>
+                <w:rFonts w:ascii="Times New Roman" w:hAnsi="Times New Roman"/>
+                <w:sz w:val="18"/>
+              </w:rPr>
+              <w:t xml:space="preserve">Low=1167 (55.9%), High=921 (44.1%)</w:t>
+            </w:r>
+          </w:p>
+        </w:tc>
+      </w:tr>
+      <w:tr>
+        <w:tc>
+          <w:tcPr>
+            <w:tcW w:type="dxa" w:w="3800"/>
+          </w:tcPr>
+          <w:p>
+            <w:r>
+              <w:rPr>
+                <w:rFonts w:ascii="Times New Roman" w:hAnsi="Times New Roman"/>
+                <w:sz w:val="18"/>
+              </w:rPr>
+              <w:t xml:space="preserve">Alzubaidi: 44 duplicates removed from 1,231 raw, leaving 1,187 unique</w:t>
+            </w:r>
+          </w:p>
+        </w:tc>
+        <w:tc>
+          <w:tcPr>
+            <w:tcW w:type="dxa" w:w="800"/>
+          </w:tcPr>
+          <w:p>
+            <w:r>
+              <w:rPr>
+                <w:rFonts w:ascii="Times New Roman" w:hAnsi="Times New Roman"/>
+                <w:sz w:val="18"/>
+              </w:rPr>
+              <w:t xml:space="preserve">R1</w:t>
+            </w:r>
+          </w:p>
+        </w:tc>
+        <w:tc>
+          <w:tcPr>
+            <w:tcW w:type="dxa" w:w="2400"/>
+          </w:tcPr>
+          <w:p>
+            <w:r>
+              <w:rPr>
+                <w:rFonts w:ascii="Times New Roman" w:hAnsi="Times New Roman"/>
+                <w:sz w:val="18"/>
+              </w:rPr>
+              <w:t xml:space="preserve">manuscript_tables.txt KEY NUMBERS</w:t>
+            </w:r>
+          </w:p>
+        </w:tc>
+        <w:tc>
+          <w:tcPr>
+            <w:tcW w:type="dxa" w:w="2000"/>
+          </w:tcPr>
+          <w:p>
+            <w:r>
+              <w:rPr>
+                <w:rFonts w:ascii="Times New Roman" w:hAnsi="Times New Roman"/>
+                <w:sz w:val="18"/>
+              </w:rPr>
+              <w:t xml:space="preserve">raw=1231, removed=44, unique=1187</w:t>
+            </w:r>
+          </w:p>
+        </w:tc>
+      </w:tr>
+      <w:tr>
+        <w:tc>
+          <w:tcPr>
+            <w:tcW w:type="dxa" w:w="3800"/>
+          </w:tcPr>
+          <w:p>
+            <w:r>
+              <w:rPr>
+                <w:rFonts w:ascii="Times New Roman" w:hAnsi="Times New Roman"/>
+                <w:sz w:val="18"/>
+              </w:rPr>
+              <w:t xml:space="preserve">Alzubaidi class balance: Low 597 (50.3%), High 590 (49.7%)</w:t>
+            </w:r>
+          </w:p>
+        </w:tc>
+        <w:tc>
+          <w:tcPr>
+            <w:tcW w:type="dxa" w:w="800"/>
+          </w:tcPr>
+          <w:p>
+            <w:r>
+              <w:rPr>
+                <w:rFonts w:ascii="Times New Roman" w:hAnsi="Times New Roman"/>
+                <w:sz w:val="18"/>
+              </w:rPr>
+              <w:t xml:space="preserve">R1</w:t>
+            </w:r>
+          </w:p>
+        </w:tc>
+        <w:tc>
+          <w:tcPr>
+            <w:tcW w:type="dxa" w:w="2400"/>
+          </w:tcPr>
+          <w:p>
+            <w:r>
+              <w:rPr>
+                <w:rFonts w:ascii="Times New Roman" w:hAnsi="Times New Roman"/>
+                <w:sz w:val="18"/>
+              </w:rPr>
+              <w:t xml:space="preserve">manuscript_tables.txt KEY NUMBERS</w:t>
+            </w:r>
+          </w:p>
+        </w:tc>
+        <w:tc>
+          <w:tcPr>
+            <w:tcW w:type="dxa" w:w="2000"/>
+          </w:tcPr>
+          <w:p>
+            <w:r>
+              <w:rPr>
+                <w:rFonts w:ascii="Times New Roman" w:hAnsi="Times New Roman"/>
+                <w:sz w:val="18"/>
+              </w:rPr>
+              <w:t xml:space="preserve">Low=597 (50.3%), High=590 (49.7%)</w:t>
+            </w:r>
+          </w:p>
+        </w:tc>
+      </w:tr>
+      <w:tr>
+        <w:tc>
+          <w:tcPr>
+            <w:tcW w:type="dxa" w:w="3800"/>
+          </w:tcPr>
+          <w:p>
+            <w:r>
+              <w:rPr>
+                <w:rFonts w:ascii="Times New Roman" w:hAnsi="Times New Roman"/>
+                <w:sz w:val="18"/>
+              </w:rPr>
+              <w:t xml:space="preserve">KNUST WCE macro F1 = 0.6518 (SD 0.0332)</w:t>
+            </w:r>
+          </w:p>
+        </w:tc>
+        <w:tc>
+          <w:tcPr>
+            <w:tcW w:type="dxa" w:w="800"/>
+          </w:tcPr>
+          <w:p>
+            <w:r>
+              <w:rPr>
+                <w:rFonts w:ascii="Times New Roman" w:hAnsi="Times New Roman"/>
+                <w:sz w:val="18"/>
+              </w:rPr>
+              <w:t xml:space="preserve">R2 / Table 3a</w:t>
+            </w:r>
+          </w:p>
+        </w:tc>
+        <w:tc>
+          <w:tcPr>
+            <w:tcW w:type="dxa" w:w="2400"/>
+          </w:tcPr>
+          <w:p>
+            <w:r>
+              <w:rPr>
+                <w:rFonts w:ascii="Times New Roman" w:hAnsi="Times New Roman"/>
+                <w:sz w:val="18"/>
+              </w:rPr>
+              <w:t xml:space="preserve">fold_level_results_knust.csv / manuscript_tables.txt Table 3a</w:t>
+            </w:r>
+          </w:p>
+        </w:tc>
+        <w:tc>
+          <w:tcPr>
+            <w:tcW w:type="dxa" w:w="2000"/>
+          </w:tcPr>
+          <w:p>
+            <w:r>
+              <w:rPr>
+                <w:rFonts w:ascii="Times New Roman" w:hAnsi="Times New Roman"/>
+                <w:sz w:val="18"/>
+              </w:rPr>
+              <w:t xml:space="preserve">0.6518 SD=0.0332</w:t>
+            </w:r>
+          </w:p>
+        </w:tc>
+      </w:tr>
+      <w:tr>
+        <w:tc>
+          <w:tcPr>
+            <w:tcW w:type="dxa" w:w="3800"/>
+          </w:tcPr>
+          <w:p>
+            <w:r>
+              <w:rPr>
+                <w:rFonts w:ascii="Times New Roman" w:hAnsi="Times New Roman"/>
+                <w:sz w:val="18"/>
+              </w:rPr>
+              <w:t xml:space="preserve">KNUST Baseline macro F1 = 0.6500 (SD 0.0347)</w:t>
+            </w:r>
+          </w:p>
+        </w:tc>
+        <w:tc>
+          <w:tcPr>
+            <w:tcW w:type="dxa" w:w="800"/>
+          </w:tcPr>
+          <w:p>
+            <w:r>
+              <w:rPr>
+                <w:rFonts w:ascii="Times New Roman" w:hAnsi="Times New Roman"/>
+                <w:sz w:val="18"/>
+              </w:rPr>
+              <w:t xml:space="preserve">R2 / Table 3a</w:t>
+            </w:r>
+          </w:p>
+        </w:tc>
+        <w:tc>
+          <w:tcPr>
+            <w:tcW w:type="dxa" w:w="2400"/>
+          </w:tcPr>
+          <w:p>
+            <w:r>
+              <w:rPr>
+                <w:rFonts w:ascii="Times New Roman" w:hAnsi="Times New Roman"/>
+                <w:sz w:val="18"/>
+              </w:rPr>
+              <w:t xml:space="preserve">fold_level_results_knust.csv / manuscript_tables.txt Table 3a</w:t>
+            </w:r>
+          </w:p>
+        </w:tc>
+        <w:tc>
+          <w:tcPr>
+            <w:tcW w:type="dxa" w:w="2000"/>
+          </w:tcPr>
+          <w:p>
+            <w:r>
+              <w:rPr>
+                <w:rFonts w:ascii="Times New Roman" w:hAnsi="Times New Roman"/>
+                <w:sz w:val="18"/>
+              </w:rPr>
+              <w:t xml:space="preserve">0.6500 SD=0.0347</w:t>
+            </w:r>
+          </w:p>
+        </w:tc>
+      </w:tr>
+      <w:tr>
+        <w:tc>
+          <w:tcPr>
+            <w:tcW w:type="dxa" w:w="3800"/>
+          </w:tcPr>
+          <w:p>
+            <w:r>
+              <w:rPr>
+                <w:rFonts w:ascii="Times New Roman" w:hAnsi="Times New Roman"/>
+                <w:sz w:val="18"/>
+              </w:rPr>
+              <w:t xml:space="preserve">KNUST WCE vs Baseline: W+=674, W-=551, ties=1, p=0.5407, r=0.0874</w:t>
+            </w:r>
+          </w:p>
+        </w:tc>
+        <w:tc>
+          <w:tcPr>
+            <w:tcW w:type="dxa" w:w="800"/>
+          </w:tcPr>
+          <w:p>
+            <w:r>
+              <w:rPr>
+                <w:rFonts w:ascii="Times New Roman" w:hAnsi="Times New Roman"/>
+                <w:sz w:val="18"/>
+              </w:rPr>
+              <w:t xml:space="preserve">R2 / R3</w:t>
+            </w:r>
+          </w:p>
+        </w:tc>
+        <w:tc>
+          <w:tcPr>
+            <w:tcW w:type="dxa" w:w="2400"/>
+          </w:tcPr>
+          <w:p>
+            <w:r>
+              <w:rPr>
+                <w:rFonts w:ascii="Times New Roman" w:hAnsi="Times New Roman"/>
+                <w:sz w:val="18"/>
+              </w:rPr>
+              <w:t xml:space="preserve">manuscript_tables.txt Table 3a + WCE vs Baseline row</w:t>
+            </w:r>
+          </w:p>
+        </w:tc>
+        <w:tc>
+          <w:tcPr>
+            <w:tcW w:type="dxa" w:w="2000"/>
+          </w:tcPr>
+          <w:p>
+            <w:r>
+              <w:rPr>
+                <w:rFonts w:ascii="Times New Roman" w:hAnsi="Times New Roman"/>
+                <w:sz w:val="18"/>
+              </w:rPr>
+              <w:t xml:space="preserve">W+=674 W-=551 ties=1 p=0.5407 r=0.0874</w:t>
+            </w:r>
+          </w:p>
+        </w:tc>
+      </w:tr>
+      <w:tr>
+        <w:tc>
+          <w:tcPr>
+            <w:tcW w:type="dxa" w:w="3800"/>
+          </w:tcPr>
+          <w:p>
+            <w:r>
+              <w:rPr>
+                <w:rFonts w:ascii="Times New Roman" w:hAnsi="Times New Roman"/>
+                <w:sz w:val="18"/>
+              </w:rPr>
+              <w:t xml:space="preserve">Alzubaidi WCE macro F1 = 0.6877 (SD 0.0545)</w:t>
+            </w:r>
+          </w:p>
+        </w:tc>
+        <w:tc>
+          <w:tcPr>
+            <w:tcW w:type="dxa" w:w="800"/>
+          </w:tcPr>
+          <w:p>
+            <w:r>
+              <w:rPr>
+                <w:rFonts w:ascii="Times New Roman" w:hAnsi="Times New Roman"/>
+                <w:sz w:val="18"/>
+              </w:rPr>
+              <w:t xml:space="preserve">R2 / Table 3b</w:t>
+            </w:r>
+          </w:p>
+        </w:tc>
+        <w:tc>
+          <w:tcPr>
+            <w:tcW w:type="dxa" w:w="2400"/>
+          </w:tcPr>
+          <w:p>
+            <w:r>
+              <w:rPr>
+                <w:rFonts w:ascii="Times New Roman" w:hAnsi="Times New Roman"/>
+                <w:sz w:val="18"/>
+              </w:rPr>
+              <w:t xml:space="preserve">fold_level_results_alzubaidi.csv / manuscript_tables.txt Table 3b</w:t>
+            </w:r>
+          </w:p>
+        </w:tc>
+        <w:tc>
+          <w:tcPr>
+            <w:tcW w:type="dxa" w:w="2000"/>
+          </w:tcPr>
+          <w:p>
+            <w:r>
+              <w:rPr>
+                <w:rFonts w:ascii="Times New Roman" w:hAnsi="Times New Roman"/>
+                <w:sz w:val="18"/>
+              </w:rPr>
+              <w:t xml:space="preserve">0.6877 SD=0.0545</w:t>
+            </w:r>
+          </w:p>
+        </w:tc>
+      </w:tr>
+      <w:tr>
+        <w:tc>
+          <w:tcPr>
+            <w:tcW w:type="dxa" w:w="3800"/>
+          </w:tcPr>
+          <w:p>
+            <w:r>
+              <w:rPr>
+                <w:rFonts w:ascii="Times New Roman" w:hAnsi="Times New Roman"/>
+                <w:sz w:val="18"/>
+              </w:rPr>
+              <w:t xml:space="preserve">Alzubaidi Baseline macro F1 = 0.6844 (SD 0.0561)</w:t>
+            </w:r>
+          </w:p>
+        </w:tc>
+        <w:tc>
+          <w:tcPr>
+            <w:tcW w:type="dxa" w:w="800"/>
+          </w:tcPr>
+          <w:p>
+            <w:r>
+              <w:rPr>
+                <w:rFonts w:ascii="Times New Roman" w:hAnsi="Times New Roman"/>
+                <w:sz w:val="18"/>
+              </w:rPr>
+              <w:t xml:space="preserve">R2 / Table 3b</w:t>
+            </w:r>
+          </w:p>
+        </w:tc>
+        <w:tc>
+          <w:tcPr>
+            <w:tcW w:type="dxa" w:w="2400"/>
+          </w:tcPr>
+          <w:p>
+            <w:r>
+              <w:rPr>
+                <w:rFonts w:ascii="Times New Roman" w:hAnsi="Times New Roman"/>
+                <w:sz w:val="18"/>
+              </w:rPr>
+              <w:t xml:space="preserve">fold_level_results_alzubaidi.csv / manuscript_tables.txt Table 3b</w:t>
+            </w:r>
+          </w:p>
+        </w:tc>
+        <w:tc>
+          <w:tcPr>
+            <w:tcW w:type="dxa" w:w="2000"/>
+          </w:tcPr>
+          <w:p>
+            <w:r>
+              <w:rPr>
+                <w:rFonts w:ascii="Times New Roman" w:hAnsi="Times New Roman"/>
+                <w:sz w:val="18"/>
+              </w:rPr>
+              <w:t xml:space="preserve">0.6844 SD=0.0561</w:t>
+            </w:r>
+          </w:p>
+        </w:tc>
+      </w:tr>
+      <w:tr>
+        <w:tc>
+          <w:tcPr>
+            <w:tcW w:type="dxa" w:w="3800"/>
+          </w:tcPr>
+          <w:p>
+            <w:r>
+              <w:rPr>
+                <w:rFonts w:ascii="Times New Roman" w:hAnsi="Times New Roman"/>
+                <w:sz w:val="18"/>
+              </w:rPr>
+              <w:t xml:space="preserve">Alzubaidi WCE vs Baseline: W+=612.5, W-=377.5, ties=6, p=0.1703, r=0.2067</w:t>
+            </w:r>
+          </w:p>
+        </w:tc>
+        <w:tc>
+          <w:tcPr>
+            <w:tcW w:type="dxa" w:w="800"/>
+          </w:tcPr>
+          <w:p>
+            <w:r>
+              <w:rPr>
+                <w:rFonts w:ascii="Times New Roman" w:hAnsi="Times New Roman"/>
+                <w:sz w:val="18"/>
+              </w:rPr>
+              <w:t xml:space="preserve">R4</w:t>
+            </w:r>
+          </w:p>
+        </w:tc>
+        <w:tc>
+          <w:tcPr>
+            <w:tcW w:type="dxa" w:w="2400"/>
+          </w:tcPr>
+          <w:p>
+            <w:r>
+              <w:rPr>
+                <w:rFonts w:ascii="Times New Roman" w:hAnsi="Times New Roman"/>
+                <w:sz w:val="18"/>
+              </w:rPr>
+              <w:t xml:space="preserve">manuscript_tables.txt Table 3b WCE vs Baseline row</w:t>
+            </w:r>
+          </w:p>
+        </w:tc>
+        <w:tc>
+          <w:tcPr>
+            <w:tcW w:type="dxa" w:w="2000"/>
+          </w:tcPr>
+          <w:p>
+            <w:r>
+              <w:rPr>
+                <w:rFonts w:ascii="Times New Roman" w:hAnsi="Times New Roman"/>
+                <w:sz w:val="18"/>
+              </w:rPr>
+              <w:t xml:space="preserve">W+=612.5 W-=377.5 ties=6 p=0.1703 r=0.2067</w:t>
+            </w:r>
+          </w:p>
+        </w:tc>
+      </w:tr>
+      <w:tr>
+        <w:tc>
+          <w:tcPr>
+            <w:tcW w:type="dxa" w:w="3800"/>
+          </w:tcPr>
+          <w:p>
+            <w:r>
+              <w:rPr>
+                <w:rFonts w:ascii="Times New Roman" w:hAnsi="Times New Roman"/>
+                <w:sz w:val="18"/>
+              </w:rPr>
+              <w:t xml:space="preserve">KNUST Naive Bayes F1 = 0.6598, Wilcoxon p = 0.0236 vs WCE</w:t>
+            </w:r>
+          </w:p>
+        </w:tc>
+        <w:tc>
+          <w:tcPr>
+            <w:tcW w:type="dxa" w:w="800"/>
+          </w:tcPr>
+          <w:p>
+            <w:r>
+              <w:rPr>
+                <w:rFonts w:ascii="Times New Roman" w:hAnsi="Times New Roman"/>
+                <w:sz w:val="18"/>
+              </w:rPr>
+              <w:t xml:space="preserve">R2</w:t>
+            </w:r>
+          </w:p>
+        </w:tc>
+        <w:tc>
+          <w:tcPr>
+            <w:tcW w:type="dxa" w:w="2400"/>
+          </w:tcPr>
+          <w:p>
+            <w:r>
+              <w:rPr>
+                <w:rFonts w:ascii="Times New Roman" w:hAnsi="Times New Roman"/>
+                <w:sz w:val="18"/>
+              </w:rPr>
+              <w:t xml:space="preserve">manuscript_tables.txt Table 3a</w:t>
+            </w:r>
+          </w:p>
+        </w:tc>
+        <w:tc>
+          <w:tcPr>
+            <w:tcW w:type="dxa" w:w="2000"/>
+          </w:tcPr>
+          <w:p>
+            <w:r>
+              <w:rPr>
+                <w:rFonts w:ascii="Times New Roman" w:hAnsi="Times New Roman"/>
+                <w:sz w:val="18"/>
+              </w:rPr>
+              <w:t xml:space="preserve">NB=0.6598 p=0.0236 r=0.3188</w:t>
+            </w:r>
+          </w:p>
+        </w:tc>
+      </w:tr>
+      <w:tr>
+        <w:tc>
+          <w:tcPr>
+            <w:tcW w:type="dxa" w:w="3800"/>
+          </w:tcPr>
+          <w:p>
+            <w:r>
+              <w:rPr>
+                <w:rFonts w:ascii="Times New Roman" w:hAnsi="Times New Roman"/>
+                <w:sz w:val="18"/>
+              </w:rPr>
+              <w:t xml:space="preserve">Ablation Arm A (no weights, depth 5): 0.6510 (SD 0.0366)</w:t>
+            </w:r>
+          </w:p>
+        </w:tc>
+        <w:tc>
+          <w:tcPr>
+            <w:tcW w:type="dxa" w:w="800"/>
+          </w:tcPr>
+          <w:p>
+            <w:r>
+              <w:rPr>
+                <w:rFonts w:ascii="Times New Roman" w:hAnsi="Times New Roman"/>
+                <w:sz w:val="18"/>
+              </w:rPr>
+              <w:t xml:space="preserve">R5 / Table 4</w:t>
+            </w:r>
+          </w:p>
+        </w:tc>
+        <w:tc>
+          <w:tcPr>
+            <w:tcW w:type="dxa" w:w="2400"/>
+          </w:tcPr>
+          <w:p>
+            <w:r>
+              <w:rPr>
+                <w:rFonts w:ascii="Times New Roman" w:hAnsi="Times New Roman"/>
+                <w:sz w:val="18"/>
+              </w:rPr>
+              <w:t xml:space="preserve">manuscript_tables.txt Table 4</w:t>
+            </w:r>
+          </w:p>
+        </w:tc>
+        <w:tc>
+          <w:tcPr>
+            <w:tcW w:type="dxa" w:w="2000"/>
+          </w:tcPr>
+          <w:p>
+            <w:r>
+              <w:rPr>
+                <w:rFonts w:ascii="Times New Roman" w:hAnsi="Times New Roman"/>
+                <w:sz w:val="18"/>
+              </w:rPr>
+              <w:t xml:space="preserve">0.6510 SD=0.0366</w:t>
+            </w:r>
+          </w:p>
+        </w:tc>
+      </w:tr>
+      <w:tr>
+        <w:tc>
+          <w:tcPr>
+            <w:tcW w:type="dxa" w:w="3800"/>
+          </w:tcPr>
+          <w:p>
+            <w:r>
+              <w:rPr>
+                <w:rFonts w:ascii="Times New Roman" w:hAnsi="Times New Roman"/>
+                <w:sz w:val="18"/>
+              </w:rPr>
+              <w:t xml:space="preserve">Ablation Arm B (no weights, depth 3): 0.6521 (SD 0.0342)</w:t>
+            </w:r>
+          </w:p>
+        </w:tc>
+        <w:tc>
+          <w:tcPr>
+            <w:tcW w:type="dxa" w:w="800"/>
+          </w:tcPr>
+          <w:p>
+            <w:r>
+              <w:rPr>
+                <w:rFonts w:ascii="Times New Roman" w:hAnsi="Times New Roman"/>
+                <w:sz w:val="18"/>
+              </w:rPr>
+              <w:t xml:space="preserve">R5 / Table 4</w:t>
+            </w:r>
+          </w:p>
+        </w:tc>
+        <w:tc>
+          <w:tcPr>
+            <w:tcW w:type="dxa" w:w="2400"/>
+          </w:tcPr>
+          <w:p>
+            <w:r>
+              <w:rPr>
+                <w:rFonts w:ascii="Times New Roman" w:hAnsi="Times New Roman"/>
+                <w:sz w:val="18"/>
+              </w:rPr>
+              <w:t xml:space="preserve">manuscript_tables.txt Table 4</w:t>
+            </w:r>
+          </w:p>
+        </w:tc>
+        <w:tc>
+          <w:tcPr>
+            <w:tcW w:type="dxa" w:w="2000"/>
+          </w:tcPr>
+          <w:p>
+            <w:r>
+              <w:rPr>
+                <w:rFonts w:ascii="Times New Roman" w:hAnsi="Times New Roman"/>
+                <w:sz w:val="18"/>
+              </w:rPr>
+              <w:t xml:space="preserve">0.6521 SD=0.0342</w:t>
+            </w:r>
+          </w:p>
+        </w:tc>
+      </w:tr>
+      <w:tr>
+        <w:tc>
+          <w:tcPr>
+            <w:tcW w:type="dxa" w:w="3800"/>
+          </w:tcPr>
+          <w:p>
+            <w:r>
+              <w:rPr>
+                <w:rFonts w:ascii="Times New Roman" w:hAnsi="Times New Roman"/>
+                <w:sz w:val="18"/>
+              </w:rPr>
+              <w:t xml:space="preserve">Ablation Arm C (WCE, depth 5): 0.6455 (SD 0.0329)</w:t>
+            </w:r>
+          </w:p>
+        </w:tc>
+        <w:tc>
+          <w:tcPr>
+            <w:tcW w:type="dxa" w:w="800"/>
+          </w:tcPr>
+          <w:p>
+            <w:r>
+              <w:rPr>
+                <w:rFonts w:ascii="Times New Roman" w:hAnsi="Times New Roman"/>
+                <w:sz w:val="18"/>
+              </w:rPr>
+              <w:t xml:space="preserve">R5 / Table 4</w:t>
+            </w:r>
+          </w:p>
+        </w:tc>
+        <w:tc>
+          <w:tcPr>
+            <w:tcW w:type="dxa" w:w="2400"/>
+          </w:tcPr>
+          <w:p>
+            <w:r>
+              <w:rPr>
+                <w:rFonts w:ascii="Times New Roman" w:hAnsi="Times New Roman"/>
+                <w:sz w:val="18"/>
+              </w:rPr>
+              <w:t xml:space="preserve">manuscript_tables.txt Table 4</w:t>
+            </w:r>
+          </w:p>
+        </w:tc>
+        <w:tc>
+          <w:tcPr>
+            <w:tcW w:type="dxa" w:w="2000"/>
+          </w:tcPr>
+          <w:p>
+            <w:r>
+              <w:rPr>
+                <w:rFonts w:ascii="Times New Roman" w:hAnsi="Times New Roman"/>
+                <w:sz w:val="18"/>
+              </w:rPr>
+              <w:t xml:space="preserve">0.6455 SD=0.0329</w:t>
+            </w:r>
+          </w:p>
+        </w:tc>
+      </w:tr>
+      <w:tr>
+        <w:tc>
+          <w:tcPr>
+            <w:tcW w:type="dxa" w:w="3800"/>
+          </w:tcPr>
+          <w:p>
+            <w:r>
+              <w:rPr>
+                <w:rFonts w:ascii="Times New Roman" w:hAnsi="Times New Roman"/>
+                <w:sz w:val="18"/>
+              </w:rPr>
+              <w:t xml:space="preserve">Ablation Arm D (WCE, depth 3): 0.6537 (SD 0.0347)</w:t>
+            </w:r>
+          </w:p>
+        </w:tc>
+        <w:tc>
+          <w:tcPr>
+            <w:tcW w:type="dxa" w:w="800"/>
+          </w:tcPr>
+          <w:p>
+            <w:r>
+              <w:rPr>
+                <w:rFonts w:ascii="Times New Roman" w:hAnsi="Times New Roman"/>
+                <w:sz w:val="18"/>
+              </w:rPr>
+              <w:t xml:space="preserve">R5 / Table 4</w:t>
+            </w:r>
+          </w:p>
+        </w:tc>
+        <w:tc>
+          <w:tcPr>
+            <w:tcW w:type="dxa" w:w="2400"/>
+          </w:tcPr>
+          <w:p>
+            <w:r>
+              <w:rPr>
+                <w:rFonts w:ascii="Times New Roman" w:hAnsi="Times New Roman"/>
+                <w:sz w:val="18"/>
+              </w:rPr>
+              <w:t xml:space="preserve">manuscript_tables.txt Table 4</w:t>
+            </w:r>
+          </w:p>
+        </w:tc>
+        <w:tc>
+          <w:tcPr>
+            <w:tcW w:type="dxa" w:w="2000"/>
+          </w:tcPr>
+          <w:p>
+            <w:r>
+              <w:rPr>
+                <w:rFonts w:ascii="Times New Roman" w:hAnsi="Times New Roman"/>
+                <w:sz w:val="18"/>
+              </w:rPr>
+              <w:t xml:space="preserve">0.6537 SD=0.0347</w:t>
+            </w:r>
+          </w:p>
+        </w:tc>
+      </w:tr>
+      <w:tr>
+        <w:tc>
+          <w:tcPr>
+            <w:tcW w:type="dxa" w:w="3800"/>
+          </w:tcPr>
+          <w:p>
+            <w:r>
+              <w:rPr>
+                <w:rFonts w:ascii="Times New Roman" w:hAnsi="Times New Roman"/>
+                <w:sz w:val="18"/>
+              </w:rPr>
+              <w:t xml:space="preserve">Depth contribution (B-A) = +0.0011, p = 0.8939</w:t>
+            </w:r>
+          </w:p>
+        </w:tc>
+        <w:tc>
+          <w:tcPr>
+            <w:tcW w:type="dxa" w:w="800"/>
+          </w:tcPr>
+          <w:p>
+            <w:r>
+              <w:rPr>
+                <w:rFonts w:ascii="Times New Roman" w:hAnsi="Times New Roman"/>
+                <w:sz w:val="18"/>
+              </w:rPr>
+              <w:t xml:space="preserve">R5</w:t>
+            </w:r>
+          </w:p>
+        </w:tc>
+        <w:tc>
+          <w:tcPr>
+            <w:tcW w:type="dxa" w:w="2400"/>
+          </w:tcPr>
+          <w:p>
+            <w:r>
+              <w:rPr>
+                <w:rFonts w:ascii="Times New Roman" w:hAnsi="Times New Roman"/>
+                <w:sz w:val="18"/>
+              </w:rPr>
+              <w:t xml:space="preserve">manuscript_tables.txt Table 4 notes</w:t>
+            </w:r>
+          </w:p>
+        </w:tc>
+        <w:tc>
+          <w:tcPr>
+            <w:tcW w:type="dxa" w:w="2000"/>
+          </w:tcPr>
+          <w:p>
+            <w:r>
+              <w:rPr>
+                <w:rFonts w:ascii="Times New Roman" w:hAnsi="Times New Roman"/>
+                <w:sz w:val="18"/>
+              </w:rPr>
+              <w:t xml:space="preserve">B-A=+0.0011 p=0.8939</w:t>
+            </w:r>
+          </w:p>
+        </w:tc>
+      </w:tr>
+      <w:tr>
+        <w:tc>
+          <w:tcPr>
+            <w:tcW w:type="dxa" w:w="3800"/>
+          </w:tcPr>
+          <w:p>
+            <w:r>
+              <w:rPr>
+                <w:rFonts w:ascii="Times New Roman" w:hAnsi="Times New Roman"/>
+                <w:sz w:val="18"/>
+              </w:rPr>
+              <w:t xml:space="preserve">Weight at depth 5 (C-A) = -0.0055, p = 0.1652</w:t>
+            </w:r>
+          </w:p>
+        </w:tc>
+        <w:tc>
+          <w:tcPr>
+            <w:tcW w:type="dxa" w:w="800"/>
+          </w:tcPr>
+          <w:p>
+            <w:r>
+              <w:rPr>
+                <w:rFonts w:ascii="Times New Roman" w:hAnsi="Times New Roman"/>
+                <w:sz w:val="18"/>
+              </w:rPr>
+              <w:t xml:space="preserve">R5</w:t>
+            </w:r>
+          </w:p>
+        </w:tc>
+        <w:tc>
+          <w:tcPr>
+            <w:tcW w:type="dxa" w:w="2400"/>
+          </w:tcPr>
+          <w:p>
+            <w:r>
+              <w:rPr>
+                <w:rFonts w:ascii="Times New Roman" w:hAnsi="Times New Roman"/>
+                <w:sz w:val="18"/>
+              </w:rPr>
+              <w:t xml:space="preserve">manuscript_tables.txt Table 4 notes</w:t>
+            </w:r>
+          </w:p>
+        </w:tc>
+        <w:tc>
+          <w:tcPr>
+            <w:tcW w:type="dxa" w:w="2000"/>
+          </w:tcPr>
+          <w:p>
+            <w:r>
+              <w:rPr>
+                <w:rFonts w:ascii="Times New Roman" w:hAnsi="Times New Roman"/>
+                <w:sz w:val="18"/>
+              </w:rPr>
+              <w:t xml:space="preserve">C-A=-0.0055 p=0.1652</w:t>
+            </w:r>
+          </w:p>
+        </w:tc>
+      </w:tr>
+      <w:tr>
+        <w:tc>
+          <w:tcPr>
+            <w:tcW w:type="dxa" w:w="3800"/>
+          </w:tcPr>
+          <w:p>
+            <w:r>
+              <w:rPr>
+                <w:rFonts w:ascii="Times New Roman" w:hAnsi="Times New Roman"/>
+                <w:sz w:val="18"/>
+              </w:rPr>
+              <w:t xml:space="preserve">Weight at depth 3 (D-B) = +0.0016, p = 0.5157</w:t>
+            </w:r>
+          </w:p>
+        </w:tc>
+        <w:tc>
+          <w:tcPr>
+            <w:tcW w:type="dxa" w:w="800"/>
+          </w:tcPr>
+          <w:p>
+            <w:r>
+              <w:rPr>
+                <w:rFonts w:ascii="Times New Roman" w:hAnsi="Times New Roman"/>
+                <w:sz w:val="18"/>
+              </w:rPr>
+              <w:t xml:space="preserve">R5</w:t>
+            </w:r>
+          </w:p>
+        </w:tc>
+        <w:tc>
+          <w:tcPr>
+            <w:tcW w:type="dxa" w:w="2400"/>
+          </w:tcPr>
+          <w:p>
+            <w:r>
+              <w:rPr>
+                <w:rFonts w:ascii="Times New Roman" w:hAnsi="Times New Roman"/>
+                <w:sz w:val="18"/>
+              </w:rPr>
+              <w:t xml:space="preserve">manuscript_tables.txt Table 4 notes</w:t>
+            </w:r>
+          </w:p>
+        </w:tc>
+        <w:tc>
+          <w:tcPr>
+            <w:tcW w:type="dxa" w:w="2000"/>
+          </w:tcPr>
+          <w:p>
+            <w:r>
+              <w:rPr>
+                <w:rFonts w:ascii="Times New Roman" w:hAnsi="Times New Roman"/>
+                <w:sz w:val="18"/>
+              </w:rPr>
+              <w:t xml:space="preserve">D-B=+0.0016 p=0.5157</w:t>
+            </w:r>
+          </w:p>
+        </w:tc>
+      </w:tr>
+      <w:tr>
+        <w:tc>
+          <w:tcPr>
+            <w:tcW w:type="dxa" w:w="3800"/>
+          </w:tcPr>
+          <w:p>
+            <w:r>
+              <w:rPr>
+                <w:rFonts w:ascii="Times New Roman" w:hAnsi="Times New Roman"/>
+                <w:sz w:val="18"/>
+              </w:rPr>
+              <w:t xml:space="preserve">KNUST SHAP: K_agg = 0.4323 (rank 1), A_agg = 0.3406 (rank 2)</w:t>
+            </w:r>
+          </w:p>
+        </w:tc>
+        <w:tc>
+          <w:tcPr>
+            <w:tcW w:type="dxa" w:w="800"/>
+          </w:tcPr>
+          <w:p>
+            <w:r>
+              <w:rPr>
+                <w:rFonts w:ascii="Times New Roman" w:hAnsi="Times New Roman"/>
+                <w:sz w:val="18"/>
+              </w:rPr>
+              <w:t xml:space="preserve">R6 / Table 6a</w:t>
+            </w:r>
+          </w:p>
+        </w:tc>
+        <w:tc>
+          <w:tcPr>
+            <w:tcW w:type="dxa" w:w="2400"/>
+          </w:tcPr>
+          <w:p>
+            <w:r>
+              <w:rPr>
+                <w:rFonts w:ascii="Times New Roman" w:hAnsi="Times New Roman"/>
+                <w:sz w:val="18"/>
+              </w:rPr>
+              <w:t xml:space="preserve">manuscript_tables.txt Table 6a</w:t>
+            </w:r>
+          </w:p>
+        </w:tc>
+        <w:tc>
+          <w:tcPr>
+            <w:tcW w:type="dxa" w:w="2000"/>
+          </w:tcPr>
+          <w:p>
+            <w:r>
+              <w:rPr>
+                <w:rFonts w:ascii="Times New Roman" w:hAnsi="Times New Roman"/>
+                <w:sz w:val="18"/>
+              </w:rPr>
+              <w:t xml:space="preserve">K_agg=0.4323 A_agg=0.3406</w:t>
+            </w:r>
+          </w:p>
+        </w:tc>
+      </w:tr>
+      <w:tr>
+        <w:tc>
+          <w:tcPr>
+            <w:tcW w:type="dxa" w:w="3800"/>
+          </w:tcPr>
+          <w:p>
+            <w:r>
+              <w:rPr>
+                <w:rFonts w:ascii="Times New Roman" w:hAnsi="Times New Roman"/>
+                <w:sz w:val="18"/>
+              </w:rPr>
+              <w:t xml:space="preserve">Alzubaidi SHAP: B18_3 = 0.4288 (rank 1), A_agg = 0.1801 (rank 4)</w:t>
+            </w:r>
+          </w:p>
+        </w:tc>
+        <w:tc>
+          <w:tcPr>
+            <w:tcW w:type="dxa" w:w="800"/>
+          </w:tcPr>
+          <w:p>
+            <w:r>
+              <w:rPr>
+                <w:rFonts w:ascii="Times New Roman" w:hAnsi="Times New Roman"/>
+                <w:sz w:val="18"/>
+              </w:rPr>
+              <w:t xml:space="preserve">R6 / Table 6b</w:t>
+            </w:r>
+          </w:p>
+        </w:tc>
+        <w:tc>
+          <w:tcPr>
+            <w:tcW w:type="dxa" w:w="2400"/>
+          </w:tcPr>
+          <w:p>
+            <w:r>
+              <w:rPr>
+                <w:rFonts w:ascii="Times New Roman" w:hAnsi="Times New Roman"/>
+                <w:sz w:val="18"/>
+              </w:rPr>
+              <w:t xml:space="preserve">manuscript_tables.txt Table 6b</w:t>
+            </w:r>
+          </w:p>
+        </w:tc>
+        <w:tc>
+          <w:tcPr>
+            <w:tcW w:type="dxa" w:w="2000"/>
+          </w:tcPr>
+          <w:p>
+            <w:r>
+              <w:rPr>
+                <w:rFonts w:ascii="Times New Roman" w:hAnsi="Times New Roman"/>
+                <w:sz w:val="18"/>
+              </w:rPr>
+              <w:t xml:space="preserve">B18_3=0.4288 A_agg=0.1801</w:t>
+            </w:r>
+          </w:p>
+        </w:tc>
+      </w:tr>
+      <w:tr>
+        <w:tc>
+          <w:tcPr>
+            <w:tcW w:type="dxa" w:w="3800"/>
+          </w:tcPr>
+          <w:p>
+            <w:r>
+              <w:rPr>
+                <w:rFonts w:ascii="Times New Roman" w:hAnsi="Times New Roman"/>
+                <w:sz w:val="18"/>
+              </w:rPr>
+              <w:t xml:space="preserve">KNUST held-out: Baseline F1 = 0.6587, AUC = 0.7075; WCE F1 = 0.6423, AUC = 0.6997</w:t>
+            </w:r>
+          </w:p>
+        </w:tc>
+        <w:tc>
+          <w:tcPr>
+            <w:tcW w:type="dxa" w:w="800"/>
+          </w:tcPr>
+          <w:p>
+            <w:r>
+              <w:rPr>
+                <w:rFonts w:ascii="Times New Roman" w:hAnsi="Times New Roman"/>
+                <w:sz w:val="18"/>
+              </w:rPr>
+              <w:t xml:space="preserve">R7</w:t>
+            </w:r>
+          </w:p>
+        </w:tc>
+        <w:tc>
+          <w:tcPr>
+            <w:tcW w:type="dxa" w:w="2400"/>
+          </w:tcPr>
+          <w:p>
+            <w:r>
+              <w:rPr>
+                <w:rFonts w:ascii="Times New Roman" w:hAnsi="Times New Roman"/>
+                <w:sz w:val="18"/>
+              </w:rPr>
+              <w:t xml:space="preserve">manuscript_tables.txt Table 5</w:t>
+            </w:r>
+          </w:p>
+        </w:tc>
+        <w:tc>
+          <w:tcPr>
+            <w:tcW w:type="dxa" w:w="2000"/>
+          </w:tcPr>
+          <w:p>
+            <w:r>
+              <w:rPr>
+                <w:rFonts w:ascii="Times New Roman" w:hAnsi="Times New Roman"/>
+                <w:sz w:val="18"/>
+              </w:rPr>
+              <w:t xml:space="preserve">Base F1=0.6587 AUC=0.7075; WCE F1=0.6423 AUC=0.6997</w:t>
+            </w:r>
+          </w:p>
+        </w:tc>
+      </w:tr>
+      <w:tr>
+        <w:tc>
+          <w:tcPr>
+            <w:tcW w:type="dxa" w:w="3800"/>
+          </w:tcPr>
+          <w:p>
+            <w:r>
+              <w:rPr>
+                <w:rFonts w:ascii="Times New Roman" w:hAnsi="Times New Roman"/>
+                <w:sz w:val="18"/>
+              </w:rPr>
+              <w:t xml:space="preserve">KNUST held-out McNemar: b=15, c=8, chi2=1.565, p=0.2109</w:t>
+            </w:r>
+          </w:p>
+        </w:tc>
+        <w:tc>
+          <w:tcPr>
+            <w:tcW w:type="dxa" w:w="800"/>
+          </w:tcPr>
+          <w:p>
+            <w:r>
+              <w:rPr>
+                <w:rFonts w:ascii="Times New Roman" w:hAnsi="Times New Roman"/>
+                <w:sz w:val="18"/>
+              </w:rPr>
+              <w:t xml:space="preserve">R7</w:t>
+            </w:r>
+          </w:p>
+        </w:tc>
+        <w:tc>
+          <w:tcPr>
+            <w:tcW w:type="dxa" w:w="2400"/>
+          </w:tcPr>
+          <w:p>
+            <w:r>
+              <w:rPr>
+                <w:rFonts w:ascii="Times New Roman" w:hAnsi="Times New Roman"/>
+                <w:sz w:val="18"/>
+              </w:rPr>
+              <w:t xml:space="preserve">manuscript_tables.txt Table 5</w:t>
+            </w:r>
+          </w:p>
+        </w:tc>
+        <w:tc>
+          <w:tcPr>
+            <w:tcW w:type="dxa" w:w="2000"/>
+          </w:tcPr>
+          <w:p>
+            <w:r>
+              <w:rPr>
+                <w:rFonts w:ascii="Times New Roman" w:hAnsi="Times New Roman"/>
+                <w:sz w:val="18"/>
+              </w:rPr>
+              <w:t xml:space="preserve">b=15 c=8 chi2=1.565 p=0.2109</w:t>
+            </w:r>
+          </w:p>
+        </w:tc>
+      </w:tr>
+      <w:tr>
+        <w:tc>
+          <w:tcPr>
+            <w:tcW w:type="dxa" w:w="3800"/>
+          </w:tcPr>
+          <w:p>
+            <w:r>
+              <w:rPr>
+                <w:rFonts w:ascii="Times New Roman" w:hAnsi="Times New Roman"/>
+                <w:sz w:val="18"/>
+              </w:rPr>
+              <w:t xml:space="preserve">Alzubaidi held-out: Baseline F1=0.7059, WCE F1=0.6974; McNemar p=0.7518</w:t>
+            </w:r>
+          </w:p>
+        </w:tc>
+        <w:tc>
+          <w:tcPr>
+            <w:tcW w:type="dxa" w:w="800"/>
+          </w:tcPr>
+          <w:p>
+            <w:r>
+              <w:rPr>
+                <w:rFonts w:ascii="Times New Roman" w:hAnsi="Times New Roman"/>
+                <w:sz w:val="18"/>
+              </w:rPr>
+              <w:t xml:space="preserve">R7 / Table 5b</w:t>
+            </w:r>
+          </w:p>
+        </w:tc>
+        <w:tc>
+          <w:tcPr>
+            <w:tcW w:type="dxa" w:w="2400"/>
+          </w:tcPr>
+          <w:p>
+            <w:r>
+              <w:rPr>
+                <w:rFonts w:ascii="Times New Roman" w:hAnsi="Times New Roman"/>
+                <w:sz w:val="18"/>
+              </w:rPr>
+              <w:t xml:space="preserve">manuscript_tables.txt Table 5b</w:t>
+            </w:r>
+          </w:p>
+        </w:tc>
+        <w:tc>
+          <w:tcPr>
+            <w:tcW w:type="dxa" w:w="2000"/>
+          </w:tcPr>
+          <w:p>
+            <w:r>
+              <w:rPr>
+                <w:rFonts w:ascii="Times New Roman" w:hAnsi="Times New Roman"/>
+                <w:sz w:val="18"/>
+              </w:rPr>
+              <w:t xml:space="preserve">Base F1=0.7059 WCE F1=0.6974 p=0.7518</w:t>
+            </w:r>
+          </w:p>
+        </w:tc>
+      </w:tr>
+      <w:tr>
+        <w:tc>
+          <w:tcPr>
+            <w:tcW w:type="dxa" w:w="3800"/>
+          </w:tcPr>
+          <w:p>
+            <w:r>
+              <w:rPr>
+                <w:rFonts w:ascii="Times New Roman" w:hAnsi="Times New Roman"/>
+                <w:sz w:val="18"/>
+              </w:rPr>
+              <w:t xml:space="preserve">Timing: KNUST baseline 13.3 ms, WCE 13.3 ms; Alzubaidi baseline 11.2 ms, WCE 11.2 ms</w:t>
+            </w:r>
+          </w:p>
+        </w:tc>
+        <w:tc>
+          <w:tcPr>
+            <w:tcW w:type="dxa" w:w="800"/>
+          </w:tcPr>
+          <w:p>
+            <w:r>
+              <w:rPr>
+                <w:rFonts w:ascii="Times New Roman" w:hAnsi="Times New Roman"/>
+                <w:sz w:val="18"/>
+              </w:rPr>
+              <w:t xml:space="preserve">R9</w:t>
+            </w:r>
+          </w:p>
+        </w:tc>
+        <w:tc>
+          <w:tcPr>
+            <w:tcW w:type="dxa" w:w="2400"/>
+          </w:tcPr>
+          <w:p>
+            <w:r>
+              <w:rPr>
+                <w:rFonts w:ascii="Times New Roman" w:hAnsi="Times New Roman"/>
+                <w:sz w:val="18"/>
+              </w:rPr>
+              <w:t xml:space="preserve">manuscript_tables.txt KEY NUMBERS TIMING</w:t>
+            </w:r>
+          </w:p>
+        </w:tc>
+        <w:tc>
+          <w:tcPr>
+            <w:tcW w:type="dxa" w:w="2000"/>
+          </w:tcPr>
+          <w:p>
+            <w:r>
+              <w:rPr>
+                <w:rFonts w:ascii="Times New Roman" w:hAnsi="Times New Roman"/>
+                <w:sz w:val="18"/>
+              </w:rPr>
+              <w:t xml:space="preserve">KNUST=13.3/13.3ms Alzubaidi=11.2/11.2ms</w:t>
+            </w:r>
+          </w:p>
+        </w:tc>
+      </w:tr>
+      <w:tr>
+        <w:tc>
+          <w:tcPr>
+            <w:tcW w:type="dxa" w:w="3800"/>
+          </w:tcPr>
+          <w:p>
+            <w:r>
+              <w:rPr>
+                <w:rFonts w:ascii="Times New Roman" w:hAnsi="Times New Roman"/>
+                <w:sz w:val="18"/>
+              </w:rPr>
+              <w:t xml:space="preserve">Skew test: WCE F1=0.559 vs Baseline 0.5555 (p=0.3642); stock SPW=0.6096 (p&lt;0.001 vs WCE)</w:t>
+            </w:r>
+          </w:p>
+        </w:tc>
+        <w:tc>
+          <w:tcPr>
+            <w:tcW w:type="dxa" w:w="800"/>
+          </w:tcPr>
+          <w:p>
+            <w:r>
+              <w:rPr>
+                <w:rFonts w:ascii="Times New Roman" w:hAnsi="Times New Roman"/>
+                <w:sz w:val="18"/>
+              </w:rPr>
+              <w:t xml:space="preserve">R10</w:t>
+            </w:r>
+          </w:p>
+        </w:tc>
+        <w:tc>
+          <w:tcPr>
+            <w:tcW w:type="dxa" w:w="2400"/>
+          </w:tcPr>
+          <w:p>
+            <w:r>
+              <w:rPr>
+                <w:rFonts w:ascii="Times New Roman" w:hAnsi="Times New Roman"/>
+                <w:sz w:val="18"/>
+              </w:rPr>
+              <w:t xml:space="preserve">manuscript_tables.txt KEY NUMBERS SKEW TEST</w:t>
+            </w:r>
+          </w:p>
+        </w:tc>
+        <w:tc>
+          <w:tcPr>
+            <w:tcW w:type="dxa" w:w="2000"/>
+          </w:tcPr>
+          <w:p>
+            <w:r>
+              <w:rPr>
+                <w:rFonts w:ascii="Times New Roman" w:hAnsi="Times New Roman"/>
+                <w:sz w:val="18"/>
+              </w:rPr>
+              <w:t xml:space="preserve">WCE=0.559 Base=0.5555 p=0.3642 SPW=0.6096</w:t>
+            </w:r>
+          </w:p>
+        </w:tc>
+      </w:tr>
+      <w:tr>
+        <w:tc>
+          <w:tcPr>
+            <w:tcW w:type="dxa" w:w="3800"/>
+          </w:tcPr>
+          <w:p>
+            <w:r>
+              <w:rPr>
+                <w:rFonts w:ascii="Times New Roman" w:hAnsi="Times New Roman"/>
+                <w:sz w:val="18"/>
+              </w:rPr>
+              <w:t xml:space="preserve">Ordinal robustness KNUST: base F1=0.6423, mean=0.6369 (SD=0.0093), CI [0.5956, 0.6884]</w:t>
+            </w:r>
+          </w:p>
+        </w:tc>
+        <w:tc>
+          <w:tcPr>
+            <w:tcW w:type="dxa" w:w="800"/>
+          </w:tcPr>
+          <w:p>
+            <w:r>
+              <w:rPr>
+                <w:rFonts w:ascii="Times New Roman" w:hAnsi="Times New Roman"/>
+                <w:sz w:val="18"/>
+              </w:rPr>
+              <w:t xml:space="preserve">R11</w:t>
+            </w:r>
+          </w:p>
+        </w:tc>
+        <w:tc>
+          <w:tcPr>
+            <w:tcW w:type="dxa" w:w="2400"/>
+          </w:tcPr>
+          <w:p>
+            <w:r>
+              <w:rPr>
+                <w:rFonts w:ascii="Times New Roman" w:hAnsi="Times New Roman"/>
+                <w:sz w:val="18"/>
+              </w:rPr>
+              <w:t xml:space="preserve">manuscript_tables.txt KEY NUMBERS ROBUSTNESS</w:t>
+            </w:r>
+          </w:p>
+        </w:tc>
+        <w:tc>
+          <w:tcPr>
+            <w:tcW w:type="dxa" w:w="2000"/>
+          </w:tcPr>
+          <w:p>
+            <w:r>
+              <w:rPr>
+                <w:rFonts w:ascii="Times New Roman" w:hAnsi="Times New Roman"/>
+                <w:sz w:val="18"/>
+              </w:rPr>
+              <w:t xml:space="preserve">base=0.6423 mean=0.6369 SD=0.0093</w:t>
+            </w:r>
+          </w:p>
+        </w:tc>
+      </w:tr>
+      <w:tr>
+        <w:tc>
+          <w:tcPr>
+            <w:tcW w:type="dxa" w:w="3800"/>
+          </w:tcPr>
+          <w:p>
+            <w:r>
+              <w:rPr>
+                <w:rFonts w:ascii="Times New Roman" w:hAnsi="Times New Roman"/>
+                <w:sz w:val="18"/>
+              </w:rPr>
+              <w:t xml:space="preserve">Ordinal robustness Alzubaidi: base F1=0.6974, mean=0.6934 (SD=0.0148), CI [0.6384, 0.7561]</w:t>
+            </w:r>
+          </w:p>
+        </w:tc>
+        <w:tc>
+          <w:tcPr>
+            <w:tcW w:type="dxa" w:w="800"/>
+          </w:tcPr>
+          <w:p>
+            <w:r>
+              <w:rPr>
+                <w:rFonts w:ascii="Times New Roman" w:hAnsi="Times New Roman"/>
+                <w:sz w:val="18"/>
+              </w:rPr>
+              <w:t xml:space="preserve">R11</w:t>
+            </w:r>
+          </w:p>
+        </w:tc>
+        <w:tc>
+          <w:tcPr>
+            <w:tcW w:type="dxa" w:w="2400"/>
+          </w:tcPr>
+          <w:p>
+            <w:r>
+              <w:rPr>
+                <w:rFonts w:ascii="Times New Roman" w:hAnsi="Times New Roman"/>
+                <w:sz w:val="18"/>
+              </w:rPr>
+              <w:t xml:space="preserve">manuscript_tables.txt KEY NUMBERS ROBUSTNESS</w:t>
+            </w:r>
+          </w:p>
+        </w:tc>
+        <w:tc>
+          <w:tcPr>
+            <w:tcW w:type="dxa" w:w="2000"/>
+          </w:tcPr>
+          <w:p>
+            <w:r>
+              <w:rPr>
+                <w:rFonts w:ascii="Times New Roman" w:hAnsi="Times New Roman"/>
+                <w:sz w:val="18"/>
+              </w:rPr>
+              <w:t xml:space="preserve">base=0.6974 mean=0.6934 SD=0.0148</w:t>
+            </w:r>
+          </w:p>
+        </w:tc>
+      </w:tr>
+      <w:tr>
+        <w:tc>
+          <w:tcPr>
+            <w:tcW w:type="dxa" w:w="3800"/>
+          </w:tcPr>
+          <w:p>
+            <w:r>
+              <w:rPr>
+                <w:rFonts w:ascii="Times New Roman" w:hAnsi="Times New Roman"/>
+                <w:sz w:val="18"/>
+              </w:rPr>
+              <w:t xml:space="preserve">Seed sensitivity: KNUST delta range -0.0033 to +0.0041, all p&gt;0.05</w:t>
+            </w:r>
+          </w:p>
+        </w:tc>
+        <w:tc>
+          <w:tcPr>
+            <w:tcW w:type="dxa" w:w="800"/>
+          </w:tcPr>
+          <w:p>
+            <w:r>
+              <w:rPr>
+                <w:rFonts w:ascii="Times New Roman" w:hAnsi="Times New Roman"/>
+                <w:sz w:val="18"/>
+              </w:rPr>
+              <w:t xml:space="preserve">R11 / Table S1</w:t>
+            </w:r>
+          </w:p>
+        </w:tc>
+        <w:tc>
+          <w:tcPr>
+            <w:tcW w:type="dxa" w:w="2400"/>
+          </w:tcPr>
+          <w:p>
+            <w:r>
+              <w:rPr>
+                <w:rFonts w:ascii="Times New Roman" w:hAnsi="Times New Roman"/>
+                <w:sz w:val="18"/>
+              </w:rPr>
+              <w:t xml:space="preserve">manuscript_tables.txt Table S1</w:t>
+            </w:r>
+          </w:p>
+        </w:tc>
+        <w:tc>
+          <w:tcPr>
+            <w:tcW w:type="dxa" w:w="2000"/>
+          </w:tcPr>
+          <w:p>
+            <w:r>
+              <w:rPr>
+                <w:rFonts w:ascii="Times New Roman" w:hAnsi="Times New Roman"/>
+                <w:sz w:val="18"/>
+              </w:rPr>
+              <w:t xml:space="preserve">seeds 0,7,13,21,42 all non-significant</w:t>
+            </w:r>
+          </w:p>
+        </w:tc>
+      </w:tr>
+    </w:tbl>
+    <w:p>
+      <w:r>
+        <w:rPr>
+          <w:rFonts w:ascii="Times New Roman" w:hAnsi="Times New Roman"/>
+          <w:sz w:val="18"/>
+        </w:rPr>
+        <w:t xml:space="preserve"/>
+      </w:r>
+    </w:p>
   </w:body>
 </w:document>
 </file>

</xml_diff>

<commit_message>
Results R11: fix all 15 VERIFY3 doc-level errors (second+third pass)
R2: Alzubaidi significance — WCE above DT/NB/SVM/RF (p<0.001)
R4/R7/R8: remove causal tie-rule/env claims; cite verifier withdrawal
R5: add Alzubaidi ablation values (depth +0.0121 p=0.0150, weight n.s.)
R6: fix fold-refit → 80% training split; fix closing sentence; fix 6b table
R7b: insert Alzubaidi held-out section (Base F1=0.7059, WCE=0.6974, p=0.7518)
R10: add Alzubaidi skew results; fix depth-curve values; add feature-set note
R11: fix robustness wording; fix seed sensitivity range

Co-Authored-By: Claude Sonnet 4.6 <noreply@anthropic.com>
Claude-Session: https://claude.ai/code/session_01VADmG4erFwh9AZJJyJ5yqP
</commit_message>
<xml_diff>
--- a/docs/Ofori_Prince_Phase1_Results_R11.docx
+++ b/docs/Ofori_Prince_Phase1_Results_R11.docx
@@ -467,7 +467,7 @@
           <w:color w:val="000000"/>
           <w:sz w:val="24"/>
         </w:rPr>
-        <w:t>Table 3 reports macro F1 for all eight classifiers on both datasets over 50 folds. On KNUST, KAB-XGBoost-WCE scored 0.6518 (SD 0.0332) versus Baseline XGBoost 0.6500 (SD 0.0347); the gain is +0.0018 and is not significant (Wilcoxon W+ = 674, W− = 551, ties = 1, p = 0.5407, r = 0.0874). On Alzubaidi, KAB-XGBoost-WCE scored 0.6877 (SD 0.0545) versus Baseline XGBoost 0.6844 (SD 0.0561); the gain is +0.0033 and is not significant (Wilcoxon W+ = 612.5, W− = 377.5, ties = 6, p = 0.1703, r = 0.2067). The weighting mechanism produces no measurable advantage on either dataset. KAB-XGBoost-WCE does not outperform baseline XGBoost on either leg; this null result is the primary finding of the study. On KNUST, one comparator scores above WCE with a significant difference: Naive Bayes at 0.6598 (Wilcoxon p = 0.0236, r = 0.3188). Logistic Regression (0.6559) and SVM (0.6545) also score above WCE but not by a significant margin. On Alzubaidi, Logistic Regression at 0.6830 is the nearest comparator to WCE (0.6877).</w:t>
+        <w:t>Table 3 reports macro F1 for all eight classifiers on both datasets over 50 folds. On KNUST, KAB-XGBoost-WCE scored 0.6518 (SD 0.0332) versus Baseline XGBoost 0.6500 (SD 0.0347); the gain is +0.0018 and is not significant (Wilcoxon W+ = 674, W− = 551, ties = 1, p = 0.5407, r = 0.0874). On Alzubaidi, KAB-XGBoost-WCE scored 0.6877 (SD 0.0545) versus Baseline XGBoost 0.6844 (SD 0.0561); the gain is +0.0033 and is not significant (Wilcoxon W+ = 612.5, W− = 377.5, ties = 6, p = 0.1703, r = 0.2067). The weighting mechanism produces no measurable advantage on either dataset. KAB-XGBoost-WCE does not outperform baseline XGBoost on either leg; this null result is the primary finding of the study. On KNUST, one comparator scores above WCE with a significant difference: Naive Bayes at 0.6598 (Wilcoxon p = 0.0236, r = 0.3188). Logistic Regression (0.6559) and SVM (0.6545) also score above WCE but not by a significant margin. On Alzubaidi, WCE (0.6877) is above all comparators. WCE is above stock scale_pos_weight (p = 0.0959), Decision Tree, Naive Bayes, SVM, and Random Forest (all p &lt; 0.001). Logistic Regression (0.6830) and Baseline (0.6844) are not significantly different from WCE.</w:t>
       </w:r>
     </w:p>
     <w:p>
@@ -1803,7 +1803,7 @@
           <w:color w:val="000000"/>
           <w:sz w:val="24"/>
         </w:rPr>
-        <w:t>On the Alzubaidi external stress-test, KAB-XGBoost-WCE versus Baseline XGBoost: W+ = 612.5, W− = 377.5, ties = 6, n_nontied = 44, p = 0.1703, effect r = 0.2067, delta = +0.0033. The difference is not significant. The R09 finding (p = 0.0098) is not reproduced. The earlier result used a different software environment and tuning grid. R11 uses pinned library versions and matched grids for both datasets. Across both legs the weighting is neutral. No cross-dataset performance transfer is claimed; the Alzubaidi construct mapping is imposed (M18), so the leg is read only as a stress-test.</w:t>
+        <w:t>On the Alzubaidi external stress-test, KAB-XGBoost-WCE versus Baseline XGBoost: W+ = 612.5, W− = 377.5, ties = 6, n_nontied = 44, p = 0.1703, effect r = 0.2067, delta = +0.0033. The difference is not significant. The R09 finding (p = 0.0098) is not reproduced. The R09 results did not reproduce under any XGBoost version tested by the verifier, so they are withdrawn. R11 pins the environment; all conclusions are drawn from the R11 run only. Across both legs the weighting is neutral. No cross-dataset performance transfer is claimed; the Alzubaidi construct mapping is imposed (M18), so the leg is read only as a stress-test.</w:t>
       </w:r>
     </w:p>
     <w:p>
@@ -1835,7 +1835,7 @@
           <w:color w:val="000000"/>
           <w:sz w:val="24"/>
         </w:rPr>
-        <w:t>All four arms use the same 5 x 10-fold splits as Table 3a, but with fixed depth (5 or 3) and fixed lambda (1.5 in Arms C and D). The Table 3a WCE row uses depth and lambda tuned within each fold, which is why Arm D (0.6537) and the Table 3a WCE row (0.6518) differ slightly. Arm A (no weights, depth 5): 0.6510 (SD 0.0366). Arm B (no weights, depth 3): 0.6521 (SD 0.0342). Arm C (WCE weights, depth 5): 0.6455 (SD 0.0329). Arm D (WCE weights, depth 3): 0.6537 (SD 0.0347). Depth contribution (B - A) = +0.0011, Wilcoxon p = 0.8939. Weight contribution at depth 5 (C - A) = -0.0055, p = 0.1652. Weight contribution at depth 3 (D - B) = +0.0016, p = 0.5157. No arm comparison reaches statistical significance. Neither depth choice nor the KAB weighting produces a reliable gain on KNUST.</w:t>
+        <w:t>All four arms use the same 5 x 10-fold splits as Table 3a, but with fixed depth (5 or 3) and fixed lambda (1.5 in Arms C and D). The Table 3a WCE row uses depth and lambda tuned within each fold, which is why Arm D (0.6537) and the Table 3a WCE row (0.6518) differ slightly. Arm A (no weights, depth 5): 0.6510 (SD 0.0366). Arm B (no weights, depth 3): 0.6521 (SD 0.0342). Arm C (WCE weights, depth 5): 0.6455 (SD 0.0329). Arm D (WCE weights, depth 3): 0.6537 (SD 0.0347). Depth contribution (B - A) = +0.0011, Wilcoxon p = 0.8939. Weight contribution at depth 5 (C - A) = -0.0055, p = 0.1652. Weight contribution at depth 3 (D - B) = +0.0016, p = 0.5157. No arm comparison reaches significance on KNUST. On Alzubaidi, depth tuning added +0.0121 (B vs A, p = 0.0150) and weighting added nothing (C vs A p = 0.3329, D vs B p = 0.6225). The weighting contributes nothing on either dataset.</w:t>
       </w:r>
     </w:p>
     <w:p>
@@ -2239,7 +2239,7 @@
           <w:color w:val="000000"/>
           <w:sz w:val="24"/>
         </w:rPr>
-        <w:t>SHAP TreeExplainer was applied to fold-refit WCE models (no data leakage; N2 fix). On KNUST the top features by mean absolute SHAP value are K_agg (0.4323) and A_agg (0.3406). The Knowledge and Attitude aggregates carry the most predictive signal. On Alzubaidi the top feature is B18_3 (0.4288). A_agg ranks fourth (0.1801); K_agg does not appear in the top ten. This gap is consistent with the weak Knowledge mapping noted in M18. All importance values are associational. The dominance of K_agg and A_agg on KNUST supports the KAB theoretical framing even where the weighting does not improve accuracy.</w:t>
+        <w:t>SHAP TreeExplainer was applied to one WCE model fitted on the 80% training split (N2 fix; no held-out rows inform the model). On KNUST the top features by mean absolute SHAP value are K_agg (0.4323) and A_agg (0.3406). The Knowledge and Attitude aggregates carry the most predictive signal. On Alzubaidi the top feature is B18_3 (0.4288). A_agg ranks fourth (0.1801); K_agg does not appear in the top ten. This gap is consistent with the weak Knowledge mapping noted in M18. All importance values are associational. K_agg and A_agg are the two most predictive features on KNUST. On Alzubaidi the top feature is B18_3 and A_agg is fourth. SHAP importance is associational only.</w:t>
       </w:r>
     </w:p>
     <w:p>
@@ -2849,7 +2849,7 @@
                 <w:color w:val="000000"/>
                 <w:sz w:val="18"/>
               </w:rPr>
-              <w:t>A_agg</w:t>
+              <w:t>B18_3</w:t>
             </w:r>
           </w:p>
         </w:tc>
@@ -2865,7 +2865,7 @@
                 <w:color w:val="000000"/>
                 <w:sz w:val="18"/>
               </w:rPr>
-              <w:t>0.1801</w:t>
+              <w:t>0.4288</w:t>
             </w:r>
           </w:p>
         </w:tc>
@@ -2899,7 +2899,7 @@
                 <w:color w:val="000000"/>
                 <w:sz w:val="18"/>
               </w:rPr>
-              <w:t>A_agg</w:t>
+              <w:t>B18_5</w:t>
             </w:r>
           </w:p>
         </w:tc>
@@ -2915,7 +2915,7 @@
                 <w:color w:val="000000"/>
                 <w:sz w:val="18"/>
               </w:rPr>
-              <w:t>0.4288</w:t>
+              <w:t>0.2602</w:t>
             </w:r>
           </w:p>
         </w:tc>
@@ -2949,7 +2949,7 @@
                 <w:color w:val="000000"/>
                 <w:sz w:val="18"/>
               </w:rPr>
-              <w:t>B18_5</w:t>
+              <w:t>B18_2</w:t>
             </w:r>
           </w:p>
         </w:tc>
@@ -2965,7 +2965,7 @@
                 <w:color w:val="000000"/>
                 <w:sz w:val="18"/>
               </w:rPr>
-              <w:t>0.2602</w:t>
+              <w:t>0.1859</w:t>
             </w:r>
           </w:p>
         </w:tc>
@@ -2999,7 +2999,7 @@
                 <w:color w:val="000000"/>
                 <w:sz w:val="18"/>
               </w:rPr>
-              <w:t>B18_2</w:t>
+              <w:t>A_agg</w:t>
             </w:r>
           </w:p>
         </w:tc>
@@ -3015,7 +3015,7 @@
                 <w:color w:val="000000"/>
                 <w:sz w:val="18"/>
               </w:rPr>
-              <w:t>0.1859</w:t>
+              <w:t>0.1801</w:t>
             </w:r>
           </w:p>
         </w:tc>
@@ -3099,7 +3099,7 @@
                 <w:color w:val="000000"/>
                 <w:sz w:val="18"/>
               </w:rPr>
-              <w:t>B18_4</w:t>
+              <w:t>B20_1</w:t>
             </w:r>
           </w:p>
         </w:tc>
@@ -3115,7 +3115,7 @@
                 <w:color w:val="000000"/>
                 <w:sz w:val="18"/>
               </w:rPr>
-              <w:t>0.1088</w:t>
+              <w:t>0.1127</w:t>
             </w:r>
           </w:p>
         </w:tc>
@@ -3149,7 +3149,7 @@
                 <w:color w:val="000000"/>
                 <w:sz w:val="18"/>
               </w:rPr>
-              <w:t>K_agg</w:t>
+              <w:t>B18_4</w:t>
             </w:r>
           </w:p>
         </w:tc>
@@ -3165,7 +3165,7 @@
                 <w:color w:val="000000"/>
                 <w:sz w:val="18"/>
               </w:rPr>
-              <w:t>0.1127</w:t>
+              <w:t>0.1088</w:t>
             </w:r>
           </w:p>
         </w:tc>
@@ -3721,7 +3721,37 @@
           <w:color w:val="000000"/>
           <w:sz w:val="24"/>
         </w:rPr>
-        <w:t>McNemar (held-out): b = 15 (baseline correct, WCE wrong), c = 8 (baseline wrong, WCE correct), chi-square = 1.565, p = 0.2109. The difference is not statistically significant. AUC: Baseline 0.7075, WCE 0.6997. The R09 McNemar result (p = 0.037) used a different software environment. R11 uses pinned library versions and a corrected confusion-matrix orientation.</w:t>
+        <w:t>McNemar (held-out): b = 15 (baseline correct, WCE wrong), c = 8 (baseline wrong, WCE correct), chi-square = 1.565, p = 0.2109. The difference is not statistically significant. AUC: Baseline 0.7075, WCE 0.6997. The R09 McNemar result (p = 0.037) did not reproduce under any XGBoost version tested by the verifier; it is withdrawn.</w:t>
+      </w:r>
+    </w:p>
+    <w:p>
+      <w:pPr>
+        <w:spacing w:after="80" w:line="360" w:lineRule="auto"/>
+        <w:jc w:val="both"/>
+      </w:pPr>
+      <w:r>
+        <w:rPr>
+          <w:rFonts w:ascii="Times New Roman" w:hAnsi="Times New Roman"/>
+          <w:b/>
+          <w:color w:val="000000"/>
+          <w:sz w:val="26"/>
+        </w:rPr>
+        <w:t>R7b. Held-out 80/20 Split Results, Alzubaidi</w:t>
+      </w:r>
+    </w:p>
+    <w:p>
+      <w:pPr>
+        <w:spacing w:after="160" w:line="360" w:lineRule="auto"/>
+        <w:jc w:val="both"/>
+      </w:pPr>
+      <w:r>
+        <w:rPr>
+          <w:rFonts w:ascii="Times New Roman" w:hAnsi="Times New Roman"/>
+          <w:b w:val="0"/>
+          <w:color w:val="000000"/>
+          <w:sz w:val="20"/>
+        </w:rPr>
+        <w:t xml:space="preserve">On the Alzubaidi 80/20 held-out partition (n = 238), Baseline confusion matrix: TN 84, FP 36, FN 34, TP 84. WCE confusion matrix: TN 81, FP 39, FN 33, TP 85. Baseline macro F1 = 0.7059, AUC = 0.7829. WCE macro F1 = 0.6974, AUC = 0.7670. McNemar: b = 6, c = 4, chi2 = 0.100, p = 0.7518 (not significant). The Baseline outperforms WCE on this split.</w:t>
       </w:r>
     </w:p>
     <w:p>
@@ -3753,7 +3783,7 @@
           <w:color w:val="000000"/>
           <w:sz w:val="24"/>
         </w:rPr>
-        <w:t>Reported separately per leg; never pooled. KNUST is primary; Alzubaidi is an external stress-test with an imposed construct mapping (M18). The proposed model does not beat the baseline on either leg (KNUST p = 0.5407, ns; Alzubaidi p = 0.1703, ns). Both legs give a null result. The R09 Alzubaidi finding (p = 0.0098) used a different software environment and an unequal tuning grid. R11 uses pinned library versions and matched grids; that result does not reproduce.</w:t>
+        <w:t>Reported separately per leg; never pooled. KNUST is primary; Alzubaidi is an external stress-test with an imposed construct mapping (M18). The proposed model does not beat the baseline on either leg (KNUST p = 0.5407, ns; Alzubaidi p = 0.1703, ns). Both legs give a null result. The R09 Alzubaidi finding (p = 0.0098) did not reproduce under any XGBoost version tested by the verifier; it is withdrawn. R11 pins the environment.</w:t>
       </w:r>
     </w:p>
     <w:p>
@@ -3833,7 +3863,7 @@
           <w:color w:val="000000"/>
           <w:sz w:val="24"/>
         </w:rPr>
-        <w:t>Second, the artificial-skew test (25% minority, n = 1556) shows: Baseline F1 = 0.5555, WCE F1 = 0.559 (gain +0.0035, p = 0.3642 vs Baseline), stock scale_pos_weight F1 = 0.6096 (gain +0.0541 vs Baseline; Wilcoxon p &lt; 0.001 vs WCE). Under genuine imbalance the class-ratio weight outperforms WCE. The KAB asymmetry weighting does not help even when imbalance is the primary concern.</w:t>
+        <w:t>Second, the artificial-skew test (25% minority, n = 1556) shows: Baseline F1 = 0.5555, WCE F1 = 0.559 (gain +0.0035, p = 0.3642 vs Baseline), stock scale_pos_weight F1 = 0.6096 (gain +0.0541 vs Baseline; Wilcoxon p &lt; 0.001 vs WCE). Under genuine imbalance the class-ratio weight outperforms WCE. The KAB asymmetry weighting does not help on KNUST even when imbalance is the primary concern. On Alzubaidi (n = 796): Baseline F1 = 0.6202, WCE F1 = 0.6116 (gain -0.0086, p = 0.0176 vs Baseline), stock scale_pos_weight F1 = 0.6369 (gain +0.0167; Wilcoxon p = 0.0029 vs WCE). The KAB weighting does not help on either dataset under artificial imbalance.</w:t>
       </w:r>
     </w:p>
     <w:p>
@@ -3849,7 +3879,7 @@
           <w:color w:val="000000"/>
           <w:sz w:val="24"/>
         </w:rPr>
-        <w:t>Third, the Decision Tree depth curve diagnoses the pre-de-duplication leakage. On the de-duplicated KNUST data the tree scores depth 1 0.6186, depth 2 0.6167, depth 3 0.6130, unlimited 0.5749. The unlimited tree is the weakest, not the strongest: once duplicate rows are removed the memorisation advantage disappears. This is the only set of depth-curve values in the document.</w:t>
+        <w:t>Third, the Decision Tree depth curve diagnoses the pre-de-duplication leakage. On the de-duplicated KNUST data the tree scores depth 1 0.6186, depth 2 0.6167, depth 3 0.6163, unlimited 0.5785. The unlimited tree is the weakest, not the strongest: once duplicate rows are removed the memorisation advantage disappears. Note: the unlimited-tree value here (0.5785) differs from the 5-fold mean in Table R10a (0.5634) because the depth curve uses only the behavioural items (Q6-Q10, Q13-Q17, Q1-Q5) as features while Table R10a uses all columns including demographics. This is the only set of depth-curve values in the document.</w:t>
       </w:r>
     </w:p>
     <w:p>
@@ -4089,7 +4119,7 @@
           <w:color w:val="000000"/>
           <w:sz w:val="24"/>
         </w:rPr>
-        <w:t>Ordinal robustness. Each ordinal item was shifted plus or minus one level (clipped to valid range) over 100 bootstrap iterations. K_agg and A_agg were recomputed from the perturbed items in each trial. KNUST: base F1 = 0.6423, perturbed mean = 0.6369 (SD = 0.0093), change = -0.0055, bootstrap 95% CI [0.5956, 0.6884]. Alzubaidi: base F1 = 0.6974, perturbed mean = 0.6934 (SD = 0.0148), change = -0.004, bootstrap 95% CI [0.6384, 0.7561]. Both datasets show modest, stable degradation. The model is not brittle to minor measurement error in the survey items.</w:t>
+        <w:t>Ordinal robustness. Each ordinal item was shifted plus or minus one level (clipped to valid range) over 100 bootstrap iterations. K_agg and A_agg were recomputed from the perturbed items in each trial. KNUST: base F1 = 0.6423, perturbed mean = 0.6369 (SD = 0.0093), change = -0.0055, bootstrap 95% CI [0.5956, 0.6884]. Alzubaidi: base F1 = 0.6974, perturbed mean = 0.6934 (SD = 0.0148), change = -0.004, bootstrap 95% CI [0.6384, 0.7561]. Both datasets show small, stable change. The model is not brittle to minor measurement error in the survey items.</w:t>
       </w:r>
     </w:p>
     <w:p>
@@ -4105,7 +4135,7 @@
           <w:color w:val="000000"/>
           <w:sz w:val="24"/>
         </w:rPr>
-        <w:t>Seed sensitivity. The full 5x10 CV was repeated across five seeds (0, 7, 13, 21, 42). Delta (WCE minus Baseline) ranged from -0.0033 to +0.0041 across all seeds on KNUST and from -0.0013 to +0.0041 on Alzubaidi. No seed produced a significant WCE advantage on either dataset. The null result is stable and not an artefact of the default seed.</w:t>
+        <w:t>Seed sensitivity. The full 5x10 CV was repeated across five seeds (0, 7, 13, 21, 42). Delta (WCE minus Baseline) ranged from -0.0033 to +0.0020 on KNUST (seeds 13 and 42 favour WCE) and from -0.0013 to +0.0041 on Alzubaidi. All p-values lie between 0.160 and 0.791. No seed produced a significant WCE advantage on either dataset. The null result is stable and not an artefact of the default seed.</w:t>
       </w:r>
     </w:p>
     <w:p>

</xml_diff>

<commit_message>
Results R11: fix Table 3a KNUST comparator SDs and DT delta
Stock spw SD 0.0365→0.0336, DT SD 0.0388→0.0376, DT delta -0.0357→-0.0316,
NB SD 0.0320→0.0313, LR SD 0.0309→0.0355, SVM SD 0.0362→0.0335,
RF SD 0.0330→0.0332

All values now match summary_results.json and VERIFY3 correct-value table.

Co-Authored-By: Claude Sonnet 4.6 <noreply@anthropic.com>
Claude-Session: https://claude.ai/code/session_01VADmG4erFwh9AZJJyJ5yqP
</commit_message>
<xml_diff>
--- a/docs/Ofori_Prince_Phase1_Results_R11.docx
+++ b/docs/Ofori_Prince_Phase1_Results_R11.docx
@@ -753,7 +753,7 @@
                 <w:color w:val="000000"/>
                 <w:sz w:val="18"/>
               </w:rPr>
-              <w:t>0.0365</w:t>
+              <w:t>0.0336</w:t>
             </w:r>
           </w:p>
         </w:tc>
@@ -819,7 +819,7 @@
                 <w:color w:val="000000"/>
                 <w:sz w:val="18"/>
               </w:rPr>
-              <w:t>0.0388</w:t>
+              <w:t>0.0376</w:t>
             </w:r>
           </w:p>
         </w:tc>
@@ -835,7 +835,7 @@
                 <w:color w:val="000000"/>
                 <w:sz w:val="18"/>
               </w:rPr>
-              <w:t>-0.0357</w:t>
+              <w:t>-0.0316</w:t>
             </w:r>
           </w:p>
         </w:tc>
@@ -885,7 +885,7 @@
                 <w:color w:val="000000"/>
                 <w:sz w:val="18"/>
               </w:rPr>
-              <w:t>0.0320</w:t>
+              <w:t>0.0313</w:t>
             </w:r>
           </w:p>
         </w:tc>
@@ -951,7 +951,7 @@
                 <w:color w:val="000000"/>
                 <w:sz w:val="18"/>
               </w:rPr>
-              <w:t>0.0309</w:t>
+              <w:t>0.0355</w:t>
             </w:r>
           </w:p>
         </w:tc>
@@ -1017,7 +1017,7 @@
                 <w:color w:val="000000"/>
                 <w:sz w:val="18"/>
               </w:rPr>
-              <w:t>0.0362</w:t>
+              <w:t>0.0335</w:t>
             </w:r>
           </w:p>
         </w:tc>
@@ -1083,7 +1083,7 @@
                 <w:color w:val="000000"/>
                 <w:sz w:val="18"/>
               </w:rPr>
-              <w:t>0.0330</w:t>
+              <w:t>0.0332</w:t>
             </w:r>
           </w:p>
         </w:tc>

</xml_diff>